<commit_message>
md2docx: a paragraph followed by a picture keeps with it; the four enablement Word copies rebuilt
Rule 15, proved on twelve before-and-after builds (lane W2): only paragraphs a picture follows gain
keep-with-next. A heading, its lead line and its picture now travel together.

Co-Authored-By: Claude Opus 5.5 <noreply@anthropic.com>
</commit_message>
<xml_diff>
--- a/docs/enablement/word/Enablement-Battlecard-v3.0.docx
+++ b/docs/enablement/word/Enablement-Battlecard-v3.0.docx
@@ -516,6 +516,7 @@
     </w:p>
     <w:p>
       <w:pPr>
+        <w:keepNext/>
         <w:spacing w:after="120" w:line="276"/>
       </w:pPr>
       <w:r>
@@ -2189,7 +2190,7 @@
         </w:numPr>
         <w:spacing w:after="60" w:line="264"/>
       </w:pPr>
-      <w:hyperlink w:history="1" r:id="rIda4j2da2l8l63wrg5wdplk">
+      <w:hyperlink w:history="1" r:id="rIdvy8nsbidyjqywe6mxvzzb">
         <w:r>
           <w:rPr>
             <w:rFonts w:ascii="Calibri" w:cs="Calibri" w:eastAsia="Calibri" w:hAnsi="Calibri"/>
@@ -2220,7 +2221,7 @@
         </w:numPr>
         <w:spacing w:after="60" w:line="264"/>
       </w:pPr>
-      <w:hyperlink w:history="1" r:id="rId4prbmkvn4w5dlkdup5xgx">
+      <w:hyperlink w:history="1" r:id="rIdftqqmz-zjofdodk7uevar">
         <w:r>
           <w:rPr>
             <w:rFonts w:ascii="Calibri" w:cs="Calibri" w:eastAsia="Calibri" w:hAnsi="Calibri"/>
@@ -2251,7 +2252,7 @@
         </w:numPr>
         <w:spacing w:after="60" w:line="264"/>
       </w:pPr>
-      <w:hyperlink w:history="1" r:id="rIdwuriqktysxrkttnejalni">
+      <w:hyperlink w:history="1" r:id="rIdyw7qdwz0ziybqcppwcrku">
         <w:r>
           <w:rPr>
             <w:rFonts w:ascii="Calibri" w:cs="Calibri" w:eastAsia="Calibri" w:hAnsi="Calibri"/>
@@ -2282,7 +2283,7 @@
         </w:numPr>
         <w:spacing w:after="60" w:line="264"/>
       </w:pPr>
-      <w:hyperlink w:history="1" r:id="rIdgj0bvs3ecutpthfw5r9rl">
+      <w:hyperlink w:history="1" r:id="rIdznydu-ydplyamdeb3jyla">
         <w:r>
           <w:rPr>
             <w:rFonts w:ascii="Calibri" w:cs="Calibri" w:eastAsia="Calibri" w:hAnsi="Calibri"/>
@@ -2313,7 +2314,7 @@
         </w:numPr>
         <w:spacing w:after="60" w:line="264"/>
       </w:pPr>
-      <w:hyperlink w:history="1" r:id="rIdr0uffglzsfje7ixyocos_">
+      <w:hyperlink w:history="1" r:id="rId8zwppu8euq9h0onxpaf66">
         <w:r>
           <w:rPr>
             <w:rFonts w:ascii="Calibri" w:cs="Calibri" w:eastAsia="Calibri" w:hAnsi="Calibri"/>
@@ -2344,7 +2345,7 @@
         </w:numPr>
         <w:spacing w:after="60" w:line="264"/>
       </w:pPr>
-      <w:hyperlink w:history="1" r:id="rIdunu1ymn0o1thiftk0sl6q">
+      <w:hyperlink w:history="1" r:id="rIdaumjrt1b19h0bne4kpir1">
         <w:r>
           <w:rPr>
             <w:rFonts w:ascii="Calibri" w:cs="Calibri" w:eastAsia="Calibri" w:hAnsi="Calibri"/>
@@ -2375,7 +2376,7 @@
         </w:numPr>
         <w:spacing w:after="60" w:line="264"/>
       </w:pPr>
-      <w:hyperlink w:history="1" r:id="rId4myk20t-epiku3ybyn8ef">
+      <w:hyperlink w:history="1" r:id="rIdtt6czocpbzt11sxz8lmhq">
         <w:r>
           <w:rPr>
             <w:rFonts w:ascii="Calibri" w:cs="Calibri" w:eastAsia="Calibri" w:hAnsi="Calibri"/>

</xml_diff>

<commit_message>
md2docx: cap a picture at 7.5 inches tall; the four enablement Word copies rebuilt with no picture parted from its heading
Rule 16 (lane W2): only pictures taller than 7.5 in change size, aspect kept.

Co-Authored-By: Claude Opus 5.5 <noreply@anthropic.com>
</commit_message>
<xml_diff>
--- a/docs/enablement/word/Enablement-Battlecard-v3.0.docx
+++ b/docs/enablement/word/Enablement-Battlecard-v3.0.docx
@@ -1639,7 +1639,7 @@
       <w:r>
         <w:drawing>
           <wp:inline distT="0" distB="0" distL="0" distR="0">
-            <wp:extent cx="5335339" cy="7315200"/>
+            <wp:extent cx="5001880" cy="6858000"/>
             <wp:effectExtent t="0" r="0" b="0" l="0"/>
             <wp:docPr id="5" name="Figure 5" descr="Each question opens a measure the customer can track on their own numbers."/>
             <wp:cNvGraphicFramePr>
@@ -1664,7 +1664,7 @@
                   <pic:spPr bwMode="auto">
                     <a:xfrm>
                       <a:off x="0" y="0"/>
-                      <a:ext cx="5335339" cy="7315200"/>
+                      <a:ext cx="5001880" cy="6858000"/>
                     </a:xfrm>
                     <a:prstGeom prst="rect">
                       <a:avLst/>
@@ -2190,7 +2190,7 @@
         </w:numPr>
         <w:spacing w:after="60" w:line="264"/>
       </w:pPr>
-      <w:hyperlink w:history="1" r:id="rIdvy8nsbidyjqywe6mxvzzb">
+      <w:hyperlink w:history="1" r:id="rIdehpstbcze4zu9vfytsdua">
         <w:r>
           <w:rPr>
             <w:rFonts w:ascii="Calibri" w:cs="Calibri" w:eastAsia="Calibri" w:hAnsi="Calibri"/>
@@ -2221,7 +2221,7 @@
         </w:numPr>
         <w:spacing w:after="60" w:line="264"/>
       </w:pPr>
-      <w:hyperlink w:history="1" r:id="rIdftqqmz-zjofdodk7uevar">
+      <w:hyperlink w:history="1" r:id="rIdp0jdgkd_qie54_xv6s2dc">
         <w:r>
           <w:rPr>
             <w:rFonts w:ascii="Calibri" w:cs="Calibri" w:eastAsia="Calibri" w:hAnsi="Calibri"/>
@@ -2252,7 +2252,7 @@
         </w:numPr>
         <w:spacing w:after="60" w:line="264"/>
       </w:pPr>
-      <w:hyperlink w:history="1" r:id="rIdyw7qdwz0ziybqcppwcrku">
+      <w:hyperlink w:history="1" r:id="rIdulcaii-m2wb416krfmblq">
         <w:r>
           <w:rPr>
             <w:rFonts w:ascii="Calibri" w:cs="Calibri" w:eastAsia="Calibri" w:hAnsi="Calibri"/>
@@ -2283,7 +2283,7 @@
         </w:numPr>
         <w:spacing w:after="60" w:line="264"/>
       </w:pPr>
-      <w:hyperlink w:history="1" r:id="rIdznydu-ydplyamdeb3jyla">
+      <w:hyperlink w:history="1" r:id="rId7ewzmapjlyea-x7lhvqu0">
         <w:r>
           <w:rPr>
             <w:rFonts w:ascii="Calibri" w:cs="Calibri" w:eastAsia="Calibri" w:hAnsi="Calibri"/>
@@ -2314,7 +2314,7 @@
         </w:numPr>
         <w:spacing w:after="60" w:line="264"/>
       </w:pPr>
-      <w:hyperlink w:history="1" r:id="rId8zwppu8euq9h0onxpaf66">
+      <w:hyperlink w:history="1" r:id="rIdwrf3cryuggg4w79n2yeg8">
         <w:r>
           <w:rPr>
             <w:rFonts w:ascii="Calibri" w:cs="Calibri" w:eastAsia="Calibri" w:hAnsi="Calibri"/>
@@ -2345,7 +2345,7 @@
         </w:numPr>
         <w:spacing w:after="60" w:line="264"/>
       </w:pPr>
-      <w:hyperlink w:history="1" r:id="rIdaumjrt1b19h0bne4kpir1">
+      <w:hyperlink w:history="1" r:id="rIdkqdueg09-yeip-vbflkzr">
         <w:r>
           <w:rPr>
             <w:rFonts w:ascii="Calibri" w:cs="Calibri" w:eastAsia="Calibri" w:hAnsi="Calibri"/>
@@ -2376,7 +2376,7 @@
         </w:numPr>
         <w:spacing w:after="60" w:line="264"/>
       </w:pPr>
-      <w:hyperlink w:history="1" r:id="rIdtt6czocpbzt11sxz8lmhq">
+      <w:hyperlink w:history="1" r:id="rIdib6-drf9fhookkpyayidk">
         <w:r>
           <w:rPr>
             <w:rFonts w:ascii="Calibri" w:cs="Calibri" w:eastAsia="Calibri" w:hAnsi="Calibri"/>

</xml_diff>